<commit_message>
Rename proposal title to data acquisition controller
</commit_message>
<xml_diff>
--- a/applications/2026/Q2/瑞莎CubieA5E-4GB商业级主板/申报书.docx
+++ b/applications/2026/Q2/瑞莎CubieA5E-4GB商业级主板/申报书.docx
@@ -16,12 +16,12 @@
     </w:p>
     <w:p>
       <w:r>
-        <w:t>瑞莎 Cubie A5E 4GB 商业级主板购买/经费需求</w:t>
+        <w:t>双网口数据采集边缘主控板购买/经费需求</w:t>
       </w:r>
     </w:p>
     <w:p>
       <w:r>
-        <w:t>摘要：拟购置瑞莎 Radxa Cubie A5E 4GB 商业级迷你主板 1 块，用作雷达、心音、心电多模态数据采集系统的边缘主控与网络转发节点。该设备采用 Allwinner A527 SoC，具备 8 核 Cortex-A55、双千兆网口、USB 3.0、USB-C OTG、40 Pin GPIO、M.2 NVMe 等能力，可支撑雷达网络接入、心音/心电外设接入、同步触发、边缘缓存和数据转发。经费金额以淘宝 4GB 商业级规格实时价格及必要配件为准，采购后预期形成可复用的实验采集节点和完整联调记录。</w:t>
+        <w:t>摘要：拟购置瑞莎 Radxa Cubie A5E 4GB 商业级迷你主板 1 块，作为双网口数据采集边缘主控板，用于多设备数据接入、网络隔离、边缘缓存与转发。该设备采用 Allwinner A527 SoC，具备 8 核 Cortex-A55、双千兆网口、USB 3.0、USB-C OTG、40 Pin GPIO、M.2 NVMe 等能力，可支撑后续雷达、心音、心电等多模态数据采集实验。经费金额以淘宝 4GB 商业级规格实时价格及必要配件为准，采购后预期形成可复用的实验采集节点和完整联调记录。</w:t>
       </w:r>
     </w:p>
     <w:p>
@@ -46,7 +46,7 @@
     </w:p>
     <w:p>
       <w:r>
-        <w:t>团队拟开展雷达生命体征信号与心音、心电信号的同步采集实验，需要一个稳定的小型边缘节点承担多设备接入、数据汇聚、时间戳记录、轻量预处理、边缘缓存和网络转发任务。</w:t>
+        <w:t>团队后续需要开展多设备同步数据采集实验，采集对象包括但不限于雷达生命体征信号、心音信号和心电信号。此类实验需要一个稳定的小型边缘节点承担多设备接入、数据汇聚、时间戳记录、轻量预处理、边缘缓存和网络转发任务。</w:t>
       </w:r>
     </w:p>
     <w:p>
@@ -64,12 +64,12 @@
     </w:p>
     <w:p>
       <w:r>
-        <w:t>该主板拟用于雷达/心音/心电同步采集系统的边缘主控。双千兆网口用于分离雷达设备网络和实验室上位机/局域网；USB 3.0、USB-C OTG 和 40 Pin GPIO 用于接入声卡、串口转换器、心电采集模块或同步触发模块；microSD/eMMC/M.2 NVMe 存储用于采集过程中的本地缓存和离线备份。</w:t>
+        <w:t>该主板拟作为双网口数据采集边缘主控板使用。双千兆网口用于分离采集设备网络和实验室上位机/局域网；USB 3.0、USB-C OTG 和 40 Pin GPIO 用于接入声卡、串口转换器、心电采集模块或同步触发模块；microSD/eMMC/M.2 NVMe 存储用于采集过程中的本地缓存和离线备份。</w:t>
       </w:r>
     </w:p>
     <w:p>
       <w:r>
-        <w:t>选用 4GB 商业级 A527 版本，主要考虑当前任务以采集、转发和轻量处理为主，不需要工业级 T527 的工业温区和 NPU 能力。该规格能够满足实验用途，同时控制预算。</w:t>
+        <w:t>在具体实验中，该主控板可用于雷达/心音/心电同步采集系统，承担雷达网络接入、心音/心电外设接入、触发同步、数据缓存和上位机转发。选用 4GB 商业级 A527 版本，主要考虑当前任务以采集、转发和轻量处理为主，不需要工业级 T527 的工业温区和 NPU 能力。该规格能够满足实验用途，同时控制预算。</w:t>
       </w:r>
     </w:p>
     <w:p>
@@ -87,12 +87,12 @@
     </w:p>
     <w:p>
       <w:r>
-        <w:t>2. 建立雷达设备网络与上位机网络分离的采集拓扑，验证连续数据接收和转发。</w:t>
+        <w:t>2. 建立采集设备网络与上位机网络分离的双网口采集拓扑，验证连续数据接收和转发。</w:t>
       </w:r>
     </w:p>
     <w:p>
       <w:r>
-        <w:t>3. 接入心音/心电采集链路，验证采样时间戳记录、文件命名和多模态数据归档。</w:t>
+        <w:t>3. 接入典型外设采集链路，验证采样时间戳记录、文件命名和多模态数据归档。</w:t>
       </w:r>
     </w:p>
     <w:p>
@@ -102,7 +102,7 @@
     </w:p>
     <w:p>
       <w:r>
-        <w:t>5. 形成至少一次完整联调记录，为后续算法验证、数据集建设和原型系统迭代提供支撑。</w:t>
+        <w:t>5. 形成至少一次完整联调记录，为后续雷达/心音/心电数据采集、算法验证、数据集建设和原型系统迭代提供支撑。</w:t>
       </w:r>
     </w:p>
     <w:p>
@@ -341,12 +341,12 @@
     </w:p>
     <w:p>
       <w:r>
-        <w:t>购置完成后，预期能够形成一套可复用的雷达/心音/心电多模态同步采集边缘节点，减少每次实验前的临时连线、网络配置和驱动调试工作。</w:t>
+        <w:t>购置完成后，预期能够形成一套可复用的双网口数据采集边缘节点，减少每次实验前的临时连线、网络配置和驱动调试工作。</w:t>
       </w:r>
     </w:p>
     <w:p>
       <w:r>
-        <w:t>该节点可支撑后续生命体征识别、非接触式生理监测、心肺耦合分析等研究，服务数据集建设、算法验证、原型样机开发和实验室平台能力积累。</w:t>
+        <w:t>该节点可服务雷达生命体征、心音、心电等多模态数据采集任务，支撑后续生命体征识别、非接触式生理监测、心肺耦合分析等研究，服务数据集建设、算法验证、原型样机开发和实验室平台能力积累。</w:t>
       </w:r>
     </w:p>
     <w:p>

</xml_diff>